<commit_message>
Registrar los servicios en Eureka como localhost para no depender de la IP de la red; actualizar integrantes en la caratula
</commit_message>
<xml_diff>
--- a/entrega/INFORME_FINAL_GRUPO5_DAW2.docx
+++ b/entrega/INFORME_FINAL_GRUPO5_DAW2.docx
@@ -11,7 +11,7 @@
           <w:noProof/>
         </w:rPr>
         <w:drawing>
-          <wp:inline distT="0" distB="0" distL="0" distR="0" wp14:anchorId="34674FAD" wp14:editId="7A685D83">
+          <wp:inline distT="0" distB="0" distL="0" distR="0" wp14:anchorId="5F37A895" wp14:editId="754B51B0">
             <wp:extent cx="1428750" cy="942975"/>
             <wp:effectExtent l="0" t="0" r="0" b="0"/>
             <wp:docPr id="1" name="logo" descr="Logo de CIBERTEC" title="CIBERTEC"/>
@@ -234,7 +234,7 @@
         <w:spacing w:after="20"/>
       </w:pPr>
       <w:r>
-        <w:t>MILLAN OLAZO KEVIN</w:t>
+        <w:t>SIHUINCHA ANGELINO VLADIMIR</w:t>
       </w:r>
     </w:p>
     <w:p>
@@ -242,7 +242,7 @@
         <w:spacing w:after="400"/>
       </w:pPr>
       <w:r>
-        <w:t>SIHUINCHA ANGELINO VLADIMIR</w:t>
+        <w:t>OYOLA ROQUE SAID</w:t>
       </w:r>
     </w:p>
     <w:p>
@@ -279,7 +279,7 @@
     <w:sdt>
       <w:sdtPr>
         <w:alias w:val="Índice"/>
-        <w:id w:val="-1551365172"/>
+        <w:id w:val="1736976955"/>
       </w:sdtPr>
       <w:sdtEndPr/>
       <w:sdtContent>
@@ -302,7 +302,7 @@
           <w:r>
             <w:fldChar w:fldCharType="separate"/>
           </w:r>
-          <w:hyperlink w:anchor="_Toc243754316" w:history="1">
+          <w:hyperlink w:anchor="_Toc243756147" w:history="1">
             <w:r>
               <w:rPr>
                 <w:rStyle w:val="Hipervnculo"/>
@@ -326,7 +326,7 @@
               <w:rPr>
                 <w:noProof/>
               </w:rPr>
-              <w:instrText xml:space="preserve"> PAGEREF _Toc243754316 \h </w:instrText>
+              <w:instrText xml:space="preserve"> PAGEREF _Toc243756147 \h </w:instrText>
             </w:r>
             <w:r>
               <w:rPr>
@@ -363,7 +363,7 @@
               <w:noProof/>
             </w:rPr>
           </w:pPr>
-          <w:hyperlink w:anchor="_Toc243754317" w:history="1">
+          <w:hyperlink w:anchor="_Toc243756148" w:history="1">
             <w:r>
               <w:rPr>
                 <w:rStyle w:val="Hipervnculo"/>
@@ -387,7 +387,7 @@
               <w:rPr>
                 <w:noProof/>
               </w:rPr>
-              <w:instrText xml:space="preserve"> PAGEREF _Toc243754317 \h </w:instrText>
+              <w:instrText xml:space="preserve"> PAGEREF _Toc243756148 \h </w:instrText>
             </w:r>
             <w:r>
               <w:rPr>
@@ -424,7 +424,7 @@
               <w:noProof/>
             </w:rPr>
           </w:pPr>
-          <w:hyperlink w:anchor="_Toc243754318" w:history="1">
+          <w:hyperlink w:anchor="_Toc243756149" w:history="1">
             <w:r>
               <w:rPr>
                 <w:rStyle w:val="Hipervnculo"/>
@@ -448,7 +448,7 @@
               <w:rPr>
                 <w:noProof/>
               </w:rPr>
-              <w:instrText xml:space="preserve"> PAGEREF _Toc243754318 \h </w:instrText>
+              <w:instrText xml:space="preserve"> PAGEREF _Toc243756149 \h </w:instrText>
             </w:r>
             <w:r>
               <w:rPr>
@@ -485,7 +485,7 @@
               <w:noProof/>
             </w:rPr>
           </w:pPr>
-          <w:hyperlink w:anchor="_Toc243754319" w:history="1">
+          <w:hyperlink w:anchor="_Toc243756150" w:history="1">
             <w:r>
               <w:rPr>
                 <w:rStyle w:val="Hipervnculo"/>
@@ -509,7 +509,7 @@
               <w:rPr>
                 <w:noProof/>
               </w:rPr>
-              <w:instrText xml:space="preserve"> PAGEREF _Toc243754319 \h </w:instrText>
+              <w:instrText xml:space="preserve"> PAGEREF _Toc243756150 \h </w:instrText>
             </w:r>
             <w:r>
               <w:rPr>
@@ -546,7 +546,7 @@
               <w:noProof/>
             </w:rPr>
           </w:pPr>
-          <w:hyperlink w:anchor="_Toc243754320" w:history="1">
+          <w:hyperlink w:anchor="_Toc243756151" w:history="1">
             <w:r>
               <w:rPr>
                 <w:rStyle w:val="Hipervnculo"/>
@@ -570,7 +570,7 @@
               <w:rPr>
                 <w:noProof/>
               </w:rPr>
-              <w:instrText xml:space="preserve"> PAGEREF _Toc243754320 \h </w:instrText>
+              <w:instrText xml:space="preserve"> PAGEREF _Toc243756151 \h </w:instrText>
             </w:r>
             <w:r>
               <w:rPr>
@@ -607,7 +607,7 @@
               <w:noProof/>
             </w:rPr>
           </w:pPr>
-          <w:hyperlink w:anchor="_Toc243754321" w:history="1">
+          <w:hyperlink w:anchor="_Toc243756152" w:history="1">
             <w:r>
               <w:rPr>
                 <w:rStyle w:val="Hipervnculo"/>
@@ -631,7 +631,7 @@
               <w:rPr>
                 <w:noProof/>
               </w:rPr>
-              <w:instrText xml:space="preserve"> PAGEREF _Toc243754321 \h </w:instrText>
+              <w:instrText xml:space="preserve"> PAGEREF _Toc243756152 \h </w:instrText>
             </w:r>
             <w:r>
               <w:rPr>
@@ -668,7 +668,7 @@
               <w:noProof/>
             </w:rPr>
           </w:pPr>
-          <w:hyperlink w:anchor="_Toc243754322" w:history="1">
+          <w:hyperlink w:anchor="_Toc243756153" w:history="1">
             <w:r>
               <w:rPr>
                 <w:rStyle w:val="Hipervnculo"/>
@@ -692,7 +692,7 @@
               <w:rPr>
                 <w:noProof/>
               </w:rPr>
-              <w:instrText xml:space="preserve"> PAGEREF _Toc243754322 \h </w:instrText>
+              <w:instrText xml:space="preserve"> PAGEREF _Toc243756153 \h </w:instrText>
             </w:r>
             <w:r>
               <w:rPr>
@@ -729,7 +729,7 @@
               <w:noProof/>
             </w:rPr>
           </w:pPr>
-          <w:hyperlink w:anchor="_Toc243754323" w:history="1">
+          <w:hyperlink w:anchor="_Toc243756154" w:history="1">
             <w:r>
               <w:rPr>
                 <w:rStyle w:val="Hipervnculo"/>
@@ -753,7 +753,7 @@
               <w:rPr>
                 <w:noProof/>
               </w:rPr>
-              <w:instrText xml:space="preserve"> PAGEREF _Toc243754323 \h </w:instrText>
+              <w:instrText xml:space="preserve"> PAGEREF _Toc243756154 \h </w:instrText>
             </w:r>
             <w:r>
               <w:rPr>
@@ -790,7 +790,7 @@
               <w:noProof/>
             </w:rPr>
           </w:pPr>
-          <w:hyperlink w:anchor="_Toc243754324" w:history="1">
+          <w:hyperlink w:anchor="_Toc243756155" w:history="1">
             <w:r>
               <w:rPr>
                 <w:rStyle w:val="Hipervnculo"/>
@@ -814,7 +814,7 @@
               <w:rPr>
                 <w:noProof/>
               </w:rPr>
-              <w:instrText xml:space="preserve"> PAGEREF _Toc243754324 \h </w:instrText>
+              <w:instrText xml:space="preserve"> PAGEREF _Toc243756155 \h </w:instrText>
             </w:r>
             <w:r>
               <w:rPr>
@@ -851,7 +851,7 @@
               <w:noProof/>
             </w:rPr>
           </w:pPr>
-          <w:hyperlink w:anchor="_Toc243754325" w:history="1">
+          <w:hyperlink w:anchor="_Toc243756156" w:history="1">
             <w:r>
               <w:rPr>
                 <w:rStyle w:val="Hipervnculo"/>
@@ -875,7 +875,7 @@
               <w:rPr>
                 <w:noProof/>
               </w:rPr>
-              <w:instrText xml:space="preserve"> PAGEREF _Toc243754325 \h </w:instrText>
+              <w:instrText xml:space="preserve"> PAGEREF _Toc243756156 \h </w:instrText>
             </w:r>
             <w:r>
               <w:rPr>
@@ -912,7 +912,7 @@
               <w:noProof/>
             </w:rPr>
           </w:pPr>
-          <w:hyperlink w:anchor="_Toc243754326" w:history="1">
+          <w:hyperlink w:anchor="_Toc243756157" w:history="1">
             <w:r>
               <w:rPr>
                 <w:rStyle w:val="Hipervnculo"/>
@@ -936,7 +936,7 @@
               <w:rPr>
                 <w:noProof/>
               </w:rPr>
-              <w:instrText xml:space="preserve"> PAGEREF _Toc243754326 \h </w:instrText>
+              <w:instrText xml:space="preserve"> PAGEREF _Toc243756157 \h </w:instrText>
             </w:r>
             <w:r>
               <w:rPr>
@@ -973,7 +973,7 @@
               <w:noProof/>
             </w:rPr>
           </w:pPr>
-          <w:hyperlink w:anchor="_Toc243754327" w:history="1">
+          <w:hyperlink w:anchor="_Toc243756158" w:history="1">
             <w:r>
               <w:rPr>
                 <w:rStyle w:val="Hipervnculo"/>
@@ -997,7 +997,7 @@
               <w:rPr>
                 <w:noProof/>
               </w:rPr>
-              <w:instrText xml:space="preserve"> PAGEREF _Toc243754327 \h </w:instrText>
+              <w:instrText xml:space="preserve"> PAGEREF _Toc243756158 \h </w:instrText>
             </w:r>
             <w:r>
               <w:rPr>
@@ -1034,7 +1034,7 @@
               <w:noProof/>
             </w:rPr>
           </w:pPr>
-          <w:hyperlink w:anchor="_Toc243754328" w:history="1">
+          <w:hyperlink w:anchor="_Toc243756159" w:history="1">
             <w:r>
               <w:rPr>
                 <w:rStyle w:val="Hipervnculo"/>
@@ -1058,7 +1058,7 @@
               <w:rPr>
                 <w:noProof/>
               </w:rPr>
-              <w:instrText xml:space="preserve"> PAGEREF _Toc243754328 \h </w:instrText>
+              <w:instrText xml:space="preserve"> PAGEREF _Toc243756159 \h </w:instrText>
             </w:r>
             <w:r>
               <w:rPr>
@@ -1095,7 +1095,7 @@
               <w:noProof/>
             </w:rPr>
           </w:pPr>
-          <w:hyperlink w:anchor="_Toc243754329" w:history="1">
+          <w:hyperlink w:anchor="_Toc243756160" w:history="1">
             <w:r>
               <w:rPr>
                 <w:rStyle w:val="Hipervnculo"/>
@@ -1119,7 +1119,7 @@
               <w:rPr>
                 <w:noProof/>
               </w:rPr>
-              <w:instrText xml:space="preserve"> PAGEREF _Toc243754329 \h </w:instrText>
+              <w:instrText xml:space="preserve"> PAGEREF _Toc243756160 \h </w:instrText>
             </w:r>
             <w:r>
               <w:rPr>
@@ -1156,7 +1156,7 @@
               <w:noProof/>
             </w:rPr>
           </w:pPr>
-          <w:hyperlink w:anchor="_Toc243754330" w:history="1">
+          <w:hyperlink w:anchor="_Toc243756161" w:history="1">
             <w:r>
               <w:rPr>
                 <w:rStyle w:val="Hipervnculo"/>
@@ -1180,7 +1180,7 @@
               <w:rPr>
                 <w:noProof/>
               </w:rPr>
-              <w:instrText xml:space="preserve"> PAGEREF _Toc243754330 \h </w:instrText>
+              <w:instrText xml:space="preserve"> PAGEREF _Toc243756161 \h </w:instrText>
             </w:r>
             <w:r>
               <w:rPr>
@@ -1217,7 +1217,7 @@
               <w:noProof/>
             </w:rPr>
           </w:pPr>
-          <w:hyperlink w:anchor="_Toc243754331" w:history="1">
+          <w:hyperlink w:anchor="_Toc243756162" w:history="1">
             <w:r>
               <w:rPr>
                 <w:rStyle w:val="Hipervnculo"/>
@@ -1241,7 +1241,7 @@
               <w:rPr>
                 <w:noProof/>
               </w:rPr>
-              <w:instrText xml:space="preserve"> PAGEREF _Toc243754331 \h </w:instrText>
+              <w:instrText xml:space="preserve"> PAGEREF _Toc243756162 \h </w:instrText>
             </w:r>
             <w:r>
               <w:rPr>
@@ -1278,7 +1278,7 @@
               <w:noProof/>
             </w:rPr>
           </w:pPr>
-          <w:hyperlink w:anchor="_Toc243754332" w:history="1">
+          <w:hyperlink w:anchor="_Toc243756163" w:history="1">
             <w:r>
               <w:rPr>
                 <w:rStyle w:val="Hipervnculo"/>
@@ -1302,7 +1302,7 @@
               <w:rPr>
                 <w:noProof/>
               </w:rPr>
-              <w:instrText xml:space="preserve"> PAGEREF _Toc243754332 \h </w:instrText>
+              <w:instrText xml:space="preserve"> PAGEREF _Toc243756163 \h </w:instrText>
             </w:r>
             <w:r>
               <w:rPr>
@@ -1339,7 +1339,7 @@
               <w:noProof/>
             </w:rPr>
           </w:pPr>
-          <w:hyperlink w:anchor="_Toc243754333" w:history="1">
+          <w:hyperlink w:anchor="_Toc243756164" w:history="1">
             <w:r>
               <w:rPr>
                 <w:rStyle w:val="Hipervnculo"/>
@@ -1363,7 +1363,7 @@
               <w:rPr>
                 <w:noProof/>
               </w:rPr>
-              <w:instrText xml:space="preserve"> PAGEREF _Toc243754333 \h </w:instrText>
+              <w:instrText xml:space="preserve"> PAGEREF _Toc243756164 \h </w:instrText>
             </w:r>
             <w:r>
               <w:rPr>
@@ -1400,7 +1400,7 @@
               <w:noProof/>
             </w:rPr>
           </w:pPr>
-          <w:hyperlink w:anchor="_Toc243754334" w:history="1">
+          <w:hyperlink w:anchor="_Toc243756165" w:history="1">
             <w:r>
               <w:rPr>
                 <w:rStyle w:val="Hipervnculo"/>
@@ -1424,7 +1424,7 @@
               <w:rPr>
                 <w:noProof/>
               </w:rPr>
-              <w:instrText xml:space="preserve"> PAGEREF _Toc243754334 \h </w:instrText>
+              <w:instrText xml:space="preserve"> PAGEREF _Toc243756165 \h </w:instrText>
             </w:r>
             <w:r>
               <w:rPr>
@@ -1461,7 +1461,7 @@
               <w:noProof/>
             </w:rPr>
           </w:pPr>
-          <w:hyperlink w:anchor="_Toc243754335" w:history="1">
+          <w:hyperlink w:anchor="_Toc243756166" w:history="1">
             <w:r>
               <w:rPr>
                 <w:rStyle w:val="Hipervnculo"/>
@@ -1485,7 +1485,7 @@
               <w:rPr>
                 <w:noProof/>
               </w:rPr>
-              <w:instrText xml:space="preserve"> PAGEREF _Toc243754335 \h </w:instrText>
+              <w:instrText xml:space="preserve"> PAGEREF _Toc243756166 \h </w:instrText>
             </w:r>
             <w:r>
               <w:rPr>
@@ -1522,7 +1522,7 @@
               <w:noProof/>
             </w:rPr>
           </w:pPr>
-          <w:hyperlink w:anchor="_Toc243754336" w:history="1">
+          <w:hyperlink w:anchor="_Toc243756167" w:history="1">
             <w:r>
               <w:rPr>
                 <w:rStyle w:val="Hipervnculo"/>
@@ -1546,7 +1546,7 @@
               <w:rPr>
                 <w:noProof/>
               </w:rPr>
-              <w:instrText xml:space="preserve"> PAGEREF _Toc243754336 \h </w:instrText>
+              <w:instrText xml:space="preserve"> PAGEREF _Toc243756167 \h </w:instrText>
             </w:r>
             <w:r>
               <w:rPr>
@@ -1583,7 +1583,7 @@
               <w:noProof/>
             </w:rPr>
           </w:pPr>
-          <w:hyperlink w:anchor="_Toc243754337" w:history="1">
+          <w:hyperlink w:anchor="_Toc243756168" w:history="1">
             <w:r>
               <w:rPr>
                 <w:rStyle w:val="Hipervnculo"/>
@@ -1607,7 +1607,7 @@
               <w:rPr>
                 <w:noProof/>
               </w:rPr>
-              <w:instrText xml:space="preserve"> PAGEREF _Toc243754337 \h </w:instrText>
+              <w:instrText xml:space="preserve"> PAGEREF _Toc243756168 \h </w:instrText>
             </w:r>
             <w:r>
               <w:rPr>
@@ -1644,7 +1644,7 @@
               <w:noProof/>
             </w:rPr>
           </w:pPr>
-          <w:hyperlink w:anchor="_Toc243754338" w:history="1">
+          <w:hyperlink w:anchor="_Toc243756169" w:history="1">
             <w:r>
               <w:rPr>
                 <w:rStyle w:val="Hipervnculo"/>
@@ -1668,7 +1668,7 @@
               <w:rPr>
                 <w:noProof/>
               </w:rPr>
-              <w:instrText xml:space="preserve"> PAGEREF _Toc243754338 \h </w:instrText>
+              <w:instrText xml:space="preserve"> PAGEREF _Toc243756169 \h </w:instrText>
             </w:r>
             <w:r>
               <w:rPr>
@@ -1705,7 +1705,7 @@
               <w:noProof/>
             </w:rPr>
           </w:pPr>
-          <w:hyperlink w:anchor="_Toc243754339" w:history="1">
+          <w:hyperlink w:anchor="_Toc243756170" w:history="1">
             <w:r>
               <w:rPr>
                 <w:rStyle w:val="Hipervnculo"/>
@@ -1729,7 +1729,7 @@
               <w:rPr>
                 <w:noProof/>
               </w:rPr>
-              <w:instrText xml:space="preserve"> PAGEREF _Toc243754339 \h </w:instrText>
+              <w:instrText xml:space="preserve"> PAGEREF _Toc243756170 \h </w:instrText>
             </w:r>
             <w:r>
               <w:rPr>
@@ -1766,7 +1766,7 @@
               <w:noProof/>
             </w:rPr>
           </w:pPr>
-          <w:hyperlink w:anchor="_Toc243754340" w:history="1">
+          <w:hyperlink w:anchor="_Toc243756171" w:history="1">
             <w:r>
               <w:rPr>
                 <w:rStyle w:val="Hipervnculo"/>
@@ -1790,7 +1790,7 @@
               <w:rPr>
                 <w:noProof/>
               </w:rPr>
-              <w:instrText xml:space="preserve"> PAGEREF _Toc243754340 \h </w:instrText>
+              <w:instrText xml:space="preserve"> PAGEREF _Toc243756171 \h </w:instrText>
             </w:r>
             <w:r>
               <w:rPr>
@@ -1827,7 +1827,7 @@
               <w:noProof/>
             </w:rPr>
           </w:pPr>
-          <w:hyperlink w:anchor="_Toc243754341" w:history="1">
+          <w:hyperlink w:anchor="_Toc243756172" w:history="1">
             <w:r>
               <w:rPr>
                 <w:rStyle w:val="Hipervnculo"/>
@@ -1851,7 +1851,7 @@
               <w:rPr>
                 <w:noProof/>
               </w:rPr>
-              <w:instrText xml:space="preserve"> PAGEREF _Toc243754341 \h </w:instrText>
+              <w:instrText xml:space="preserve"> PAGEREF _Toc243756172 \h </w:instrText>
             </w:r>
             <w:r>
               <w:rPr>
@@ -1888,7 +1888,7 @@
               <w:noProof/>
             </w:rPr>
           </w:pPr>
-          <w:hyperlink w:anchor="_Toc243754342" w:history="1">
+          <w:hyperlink w:anchor="_Toc243756173" w:history="1">
             <w:r>
               <w:rPr>
                 <w:rStyle w:val="Hipervnculo"/>
@@ -1912,7 +1912,7 @@
               <w:rPr>
                 <w:noProof/>
               </w:rPr>
-              <w:instrText xml:space="preserve"> PAGEREF _Toc243754342 \h </w:instrText>
+              <w:instrText xml:space="preserve"> PAGEREF _Toc243756173 \h </w:instrText>
             </w:r>
             <w:r>
               <w:rPr>
@@ -1949,7 +1949,7 @@
               <w:noProof/>
             </w:rPr>
           </w:pPr>
-          <w:hyperlink w:anchor="_Toc243754343" w:history="1">
+          <w:hyperlink w:anchor="_Toc243756174" w:history="1">
             <w:r>
               <w:rPr>
                 <w:rStyle w:val="Hipervnculo"/>
@@ -1973,7 +1973,7 @@
               <w:rPr>
                 <w:noProof/>
               </w:rPr>
-              <w:instrText xml:space="preserve"> PAGEREF _Toc243754343 \h </w:instrText>
+              <w:instrText xml:space="preserve"> PAGEREF _Toc243756174 \h </w:instrText>
             </w:r>
             <w:r>
               <w:rPr>
@@ -2010,7 +2010,7 @@
               <w:noProof/>
             </w:rPr>
           </w:pPr>
-          <w:hyperlink w:anchor="_Toc243754344" w:history="1">
+          <w:hyperlink w:anchor="_Toc243756175" w:history="1">
             <w:r>
               <w:rPr>
                 <w:rStyle w:val="Hipervnculo"/>
@@ -2034,7 +2034,7 @@
               <w:rPr>
                 <w:noProof/>
               </w:rPr>
-              <w:instrText xml:space="preserve"> PAGEREF _Toc243754344 \h </w:instrText>
+              <w:instrText xml:space="preserve"> PAGEREF _Toc243756175 \h </w:instrText>
             </w:r>
             <w:r>
               <w:rPr>
@@ -2071,7 +2071,7 @@
               <w:noProof/>
             </w:rPr>
           </w:pPr>
-          <w:hyperlink w:anchor="_Toc243754345" w:history="1">
+          <w:hyperlink w:anchor="_Toc243756176" w:history="1">
             <w:r>
               <w:rPr>
                 <w:rStyle w:val="Hipervnculo"/>
@@ -2095,7 +2095,7 @@
               <w:rPr>
                 <w:noProof/>
               </w:rPr>
-              <w:instrText xml:space="preserve"> PAGEREF _Toc243754345 \h </w:instrText>
+              <w:instrText xml:space="preserve"> PAGEREF _Toc243756176 \h </w:instrText>
             </w:r>
             <w:r>
               <w:rPr>
@@ -2132,7 +2132,7 @@
               <w:noProof/>
             </w:rPr>
           </w:pPr>
-          <w:hyperlink w:anchor="_Toc243754346" w:history="1">
+          <w:hyperlink w:anchor="_Toc243756177" w:history="1">
             <w:r>
               <w:rPr>
                 <w:rStyle w:val="Hipervnculo"/>
@@ -2156,7 +2156,7 @@
               <w:rPr>
                 <w:noProof/>
               </w:rPr>
-              <w:instrText xml:space="preserve"> PAGEREF _Toc243754346 \h </w:instrText>
+              <w:instrText xml:space="preserve"> PAGEREF _Toc243756177 \h </w:instrText>
             </w:r>
             <w:r>
               <w:rPr>
@@ -2193,7 +2193,7 @@
               <w:noProof/>
             </w:rPr>
           </w:pPr>
-          <w:hyperlink w:anchor="_Toc243754347" w:history="1">
+          <w:hyperlink w:anchor="_Toc243756178" w:history="1">
             <w:r>
               <w:rPr>
                 <w:rStyle w:val="Hipervnculo"/>
@@ -2217,7 +2217,7 @@
               <w:rPr>
                 <w:noProof/>
               </w:rPr>
-              <w:instrText xml:space="preserve"> PAGEREF _Toc243754347 \h </w:instrText>
+              <w:instrText xml:space="preserve"> PAGEREF _Toc243756178 \h </w:instrText>
             </w:r>
             <w:r>
               <w:rPr>
@@ -2254,7 +2254,7 @@
               <w:noProof/>
             </w:rPr>
           </w:pPr>
-          <w:hyperlink w:anchor="_Toc243754348" w:history="1">
+          <w:hyperlink w:anchor="_Toc243756179" w:history="1">
             <w:r>
               <w:rPr>
                 <w:rStyle w:val="Hipervnculo"/>
@@ -2278,7 +2278,7 @@
               <w:rPr>
                 <w:noProof/>
               </w:rPr>
-              <w:instrText xml:space="preserve"> PAGEREF _Toc243754348 \h </w:instrText>
+              <w:instrText xml:space="preserve"> PAGEREF _Toc243756179 \h </w:instrText>
             </w:r>
             <w:r>
               <w:rPr>
@@ -2317,7 +2317,7 @@
         <w:pStyle w:val="Ttulo1"/>
         <w:pageBreakBefore/>
       </w:pPr>
-      <w:bookmarkStart w:id="0" w:name="_Toc243754316"/>
+      <w:bookmarkStart w:id="0" w:name="_Toc243756147"/>
       <w:r>
         <w:lastRenderedPageBreak/>
         <w:t>1. RESUMEN</w:t>
@@ -2490,7 +2490,7 @@
       <w:pPr>
         <w:pStyle w:val="Ttulo1"/>
       </w:pPr>
-      <w:bookmarkStart w:id="1" w:name="_Toc243754317"/>
+      <w:bookmarkStart w:id="1" w:name="_Toc243756148"/>
       <w:r>
         <w:lastRenderedPageBreak/>
         <w:t>2. INTRODUCCIÓN</w:t>
@@ -2536,7 +2536,7 @@
       <w:pPr>
         <w:pStyle w:val="Ttulo1"/>
       </w:pPr>
-      <w:bookmarkStart w:id="2" w:name="_Toc243754318"/>
+      <w:bookmarkStart w:id="2" w:name="_Toc243756149"/>
       <w:r>
         <w:t>3. DIAGNÓSTICO</w:t>
       </w:r>
@@ -2546,7 +2546,7 @@
       <w:pPr>
         <w:pStyle w:val="Ttulo2"/>
       </w:pPr>
-      <w:bookmarkStart w:id="3" w:name="_Toc243754319"/>
+      <w:bookmarkStart w:id="3" w:name="_Toc243756150"/>
       <w:r>
         <w:t>3.1 Diagnóstico situacional</w:t>
       </w:r>
@@ -2640,7 +2640,7 @@
       <w:pPr>
         <w:pStyle w:val="Ttulo2"/>
       </w:pPr>
-      <w:bookmarkStart w:id="4" w:name="_Toc243754320"/>
+      <w:bookmarkStart w:id="4" w:name="_Toc243756151"/>
       <w:r>
         <w:t>3.2 Análisis SEPTE</w:t>
       </w:r>
@@ -3121,7 +3121,7 @@
       <w:pPr>
         <w:pStyle w:val="Ttulo2"/>
       </w:pPr>
-      <w:bookmarkStart w:id="5" w:name="_Toc243754321"/>
+      <w:bookmarkStart w:id="5" w:name="_Toc243756152"/>
       <w:r>
         <w:t>3.3 Síntesis del análisis SEPTE</w:t>
       </w:r>
@@ -3788,7 +3788,7 @@
       <w:pPr>
         <w:pStyle w:val="Ttulo1"/>
       </w:pPr>
-      <w:bookmarkStart w:id="6" w:name="_Toc243754322"/>
+      <w:bookmarkStart w:id="6" w:name="_Toc243756153"/>
       <w:r>
         <w:t>4. OBJETIVOS</w:t>
       </w:r>
@@ -4187,7 +4187,7 @@
       <w:pPr>
         <w:pStyle w:val="Ttulo1"/>
       </w:pPr>
-      <w:bookmarkStart w:id="7" w:name="_Toc243754323"/>
+      <w:bookmarkStart w:id="7" w:name="_Toc243756154"/>
       <w:r>
         <w:lastRenderedPageBreak/>
         <w:t>5. JUSTIFICACIÓN DEL PROYECTO</w:t>
@@ -4462,7 +4462,7 @@
       <w:pPr>
         <w:pStyle w:val="Ttulo1"/>
       </w:pPr>
-      <w:bookmarkStart w:id="8" w:name="_Toc243754324"/>
+      <w:bookmarkStart w:id="8" w:name="_Toc243756155"/>
       <w:r>
         <w:t>6. DEFINICIÓN Y ALCANCE</w:t>
       </w:r>
@@ -4472,7 +4472,7 @@
       <w:pPr>
         <w:pStyle w:val="Ttulo2"/>
       </w:pPr>
-      <w:bookmarkStart w:id="9" w:name="_Toc243754325"/>
+      <w:bookmarkStart w:id="9" w:name="_Toc243756156"/>
       <w:r>
         <w:t>6.1 Descripción y funcionamiento</w:t>
       </w:r>
@@ -4571,7 +4571,7 @@
       <w:pPr>
         <w:pStyle w:val="Ttulo2"/>
       </w:pPr>
-      <w:bookmarkStart w:id="10" w:name="_Toc243754326"/>
+      <w:bookmarkStart w:id="10" w:name="_Toc243756157"/>
       <w:r>
         <w:t>6.2 Arquitectura</w:t>
       </w:r>
@@ -4690,7 +4690,7 @@
           <w:noProof/>
         </w:rPr>
         <w:drawing>
-          <wp:inline distT="0" distB="0" distL="0" distR="0" wp14:anchorId="10D8573D" wp14:editId="56978152">
+          <wp:inline distT="0" distB="0" distL="0" distR="0" wp14:anchorId="6589CCEA" wp14:editId="72871023">
             <wp:extent cx="5753100" cy="2571750"/>
             <wp:effectExtent l="0" t="0" r="0" b="0"/>
             <wp:docPr id="2" name="C:\Users\Jennyfer\Desktop\Proyecto aplicaciones web\sigac\docs\diagramas\arquitectura.png" descr="C:\Users\Jennyfer\Desktop\Proyecto aplicaciones web\sigac\docs\diagramas\arquitectura.png" title="C:\Users\Jennyfer\Desktop\Proyecto aplicaciones web\sigac\docs\diagramas\arquitectura.png"/>
@@ -4748,7 +4748,7 @@
       <w:pPr>
         <w:pStyle w:val="Ttulo2"/>
       </w:pPr>
-      <w:bookmarkStart w:id="11" w:name="_Toc243754327"/>
+      <w:bookmarkStart w:id="11" w:name="_Toc243756158"/>
       <w:r>
         <w:t>6.3 Tecnologías utilizadas</w:t>
       </w:r>
@@ -5620,7 +5620,7 @@
       <w:pPr>
         <w:pStyle w:val="Ttulo2"/>
       </w:pPr>
-      <w:bookmarkStart w:id="12" w:name="_Toc243754328"/>
+      <w:bookmarkStart w:id="12" w:name="_Toc243756159"/>
       <w:r>
         <w:t>6.4 Servicios web REST</w:t>
       </w:r>
@@ -8290,7 +8290,7 @@
       <w:pPr>
         <w:pStyle w:val="Ttulo2"/>
       </w:pPr>
-      <w:bookmarkStart w:id="13" w:name="_Toc243754329"/>
+      <w:bookmarkStart w:id="13" w:name="_Toc243756160"/>
       <w:r>
         <w:t>6.5 Servicio de login y seguridad</w:t>
       </w:r>
@@ -8394,7 +8394,7 @@
       <w:pPr>
         <w:pStyle w:val="Ttulo2"/>
       </w:pPr>
-      <w:bookmarkStart w:id="14" w:name="_Toc243754330"/>
+      <w:bookmarkStart w:id="14" w:name="_Toc243756161"/>
       <w:r>
         <w:t>6.6 Integridad y reglas de negocio</w:t>
       </w:r>
@@ -8510,7 +8510,7 @@
       <w:pPr>
         <w:pStyle w:val="Ttulo2"/>
       </w:pPr>
-      <w:bookmarkStart w:id="15" w:name="_Toc243754331"/>
+      <w:bookmarkStart w:id="15" w:name="_Toc243756162"/>
       <w:r>
         <w:t>6.7 Aplicación Angular (frontend)</w:t>
       </w:r>
@@ -8531,7 +8531,7 @@
       <w:pPr>
         <w:pStyle w:val="Ttulo2"/>
       </w:pPr>
-      <w:bookmarkStart w:id="16" w:name="_Toc243754332"/>
+      <w:bookmarkStart w:id="16" w:name="_Toc243756163"/>
       <w:r>
         <w:t>6.8 Patrones de diseño y buenas prácticas</w:t>
       </w:r>
@@ -9718,7 +9718,7 @@
       <w:pPr>
         <w:pStyle w:val="Ttulo2"/>
       </w:pPr>
-      <w:bookmarkStart w:id="17" w:name="_Toc243754333"/>
+      <w:bookmarkStart w:id="17" w:name="_Toc243756164"/>
       <w:r>
         <w:t>6.9 Documentación entregada</w:t>
       </w:r>
@@ -10400,7 +10400,7 @@
       <w:pPr>
         <w:pStyle w:val="Ttulo2"/>
       </w:pPr>
-      <w:bookmarkStart w:id="18" w:name="_Toc243754334"/>
+      <w:bookmarkStart w:id="18" w:name="_Toc243756165"/>
       <w:r>
         <w:t>6.10 Alcance, límites y trabajo futuro</w:t>
       </w:r>
@@ -10474,7 +10474,7 @@
       <w:pPr>
         <w:pStyle w:val="Ttulo1"/>
       </w:pPr>
-      <w:bookmarkStart w:id="19" w:name="_Toc243754335"/>
+      <w:bookmarkStart w:id="19" w:name="_Toc243756166"/>
       <w:r>
         <w:t>7. PRODUCTOS Y ENTREGABLES</w:t>
       </w:r>
@@ -11376,7 +11376,7 @@
       <w:pPr>
         <w:pStyle w:val="Ttulo1"/>
       </w:pPr>
-      <w:bookmarkStart w:id="20" w:name="_Toc243754336"/>
+      <w:bookmarkStart w:id="20" w:name="_Toc243756167"/>
       <w:r>
         <w:t>8. CONCLUSIONES</w:t>
       </w:r>
@@ -11431,7 +11431,7 @@
       <w:pPr>
         <w:pStyle w:val="Ttulo1"/>
       </w:pPr>
-      <w:bookmarkStart w:id="21" w:name="_Toc243754337"/>
+      <w:bookmarkStart w:id="21" w:name="_Toc243756168"/>
       <w:r>
         <w:lastRenderedPageBreak/>
         <w:t>9. RECOMENDACIONES</w:t>
@@ -11487,7 +11487,7 @@
       <w:pPr>
         <w:pStyle w:val="Ttulo1"/>
       </w:pPr>
-      <w:bookmarkStart w:id="22" w:name="_Toc243754338"/>
+      <w:bookmarkStart w:id="22" w:name="_Toc243756169"/>
       <w:r>
         <w:t>10. GLOSARIO</w:t>
       </w:r>
@@ -13478,7 +13478,7 @@
       <w:pPr>
         <w:pStyle w:val="Ttulo1"/>
       </w:pPr>
-      <w:bookmarkStart w:id="23" w:name="_Toc243754339"/>
+      <w:bookmarkStart w:id="23" w:name="_Toc243756170"/>
       <w:r>
         <w:t>11. BIBLIOGRAFÍA</w:t>
       </w:r>
@@ -13680,7 +13680,7 @@
         <w:pStyle w:val="Ttulo1"/>
         <w:pageBreakBefore/>
       </w:pPr>
-      <w:bookmarkStart w:id="24" w:name="_Toc243754340"/>
+      <w:bookmarkStart w:id="24" w:name="_Toc243756171"/>
       <w:r>
         <w:lastRenderedPageBreak/>
         <w:t>ANEXOS</w:t>
@@ -13691,7 +13691,7 @@
       <w:pPr>
         <w:pStyle w:val="Ttulo2"/>
       </w:pPr>
-      <w:bookmarkStart w:id="25" w:name="_Toc243754341"/>
+      <w:bookmarkStart w:id="25" w:name="_Toc243756172"/>
       <w:r>
         <w:t>Anexo A. Capturas de pantalla del sistema</w:t>
       </w:r>
@@ -13716,7 +13716,7 @@
           <w:noProof/>
         </w:rPr>
         <w:drawing>
-          <wp:inline distT="0" distB="0" distL="0" distR="0" wp14:anchorId="0D490F8B" wp14:editId="46E5F86D">
+          <wp:inline distT="0" distB="0" distL="0" distR="0" wp14:anchorId="4282F478" wp14:editId="34E96CD9">
             <wp:extent cx="4476750" cy="2514600"/>
             <wp:effectExtent l="0" t="0" r="0" b="0"/>
             <wp:docPr id="3" name="C:\Users\Jennyfer\Desktop\Proyecto aplicaciones web\sigac\docs\capturas\01-login.png" descr="C:\Users\Jennyfer\Desktop\Proyecto aplicaciones web\sigac\docs\capturas\01-login.png" title="C:\Users\Jennyfer\Desktop\Proyecto aplicaciones web\sigac\docs\capturas\01-login.png"/>
@@ -13782,7 +13782,7 @@
         </w:rPr>
         <w:lastRenderedPageBreak/>
         <w:drawing>
-          <wp:inline distT="0" distB="0" distL="0" distR="0" wp14:anchorId="7F783886" wp14:editId="421D5F18">
+          <wp:inline distT="0" distB="0" distL="0" distR="0" wp14:anchorId="7A017EB8" wp14:editId="26675A66">
             <wp:extent cx="4476750" cy="2514600"/>
             <wp:effectExtent l="0" t="0" r="0" b="0"/>
             <wp:docPr id="4" name="C:\Users\Jennyfer\Desktop\Proyecto aplicaciones web\sigac\docs\capturas\02-socios-listado.png" descr="C:\Users\Jennyfer\Desktop\Proyecto aplicaciones web\sigac\docs\capturas\02-socios-listado.png" title="C:\Users\Jennyfer\Desktop\Proyecto aplicaciones web\sigac\docs\capturas\02-socios-listado.png"/>
@@ -13847,7 +13847,7 @@
           <w:noProof/>
         </w:rPr>
         <w:drawing>
-          <wp:inline distT="0" distB="0" distL="0" distR="0" wp14:anchorId="7BD603A4" wp14:editId="5C56A84E">
+          <wp:inline distT="0" distB="0" distL="0" distR="0" wp14:anchorId="6603B0C7" wp14:editId="36A1A533">
             <wp:extent cx="4476750" cy="2514600"/>
             <wp:effectExtent l="0" t="0" r="0" b="0"/>
             <wp:docPr id="5" name="C:\Users\Jennyfer\Desktop\Proyecto aplicaciones web\sigac\docs\capturas\03-socio-formulario.png" descr="C:\Users\Jennyfer\Desktop\Proyecto aplicaciones web\sigac\docs\capturas\03-socio-formulario.png" title="C:\Users\Jennyfer\Desktop\Proyecto aplicaciones web\sigac\docs\capturas\03-socio-formulario.png"/>
@@ -13913,7 +13913,7 @@
         </w:rPr>
         <w:lastRenderedPageBreak/>
         <w:drawing>
-          <wp:inline distT="0" distB="0" distL="0" distR="0" wp14:anchorId="0383B0C0" wp14:editId="6E206541">
+          <wp:inline distT="0" distB="0" distL="0" distR="0" wp14:anchorId="724B665F" wp14:editId="51A34A57">
             <wp:extent cx="4476750" cy="2514600"/>
             <wp:effectExtent l="0" t="0" r="0" b="0"/>
             <wp:docPr id="6" name="C:\Users\Jennyfer\Desktop\Proyecto aplicaciones web\sigac\docs\capturas\04-puestos.png" descr="C:\Users\Jennyfer\Desktop\Proyecto aplicaciones web\sigac\docs\capturas\04-puestos.png" title="C:\Users\Jennyfer\Desktop\Proyecto aplicaciones web\sigac\docs\capturas\04-puestos.png"/>
@@ -13978,7 +13978,7 @@
           <w:noProof/>
         </w:rPr>
         <w:drawing>
-          <wp:inline distT="0" distB="0" distL="0" distR="0" wp14:anchorId="6BD94E98" wp14:editId="0AA91149">
+          <wp:inline distT="0" distB="0" distL="0" distR="0" wp14:anchorId="0067C0F4" wp14:editId="2761FFD9">
             <wp:extent cx="4476750" cy="2514600"/>
             <wp:effectExtent l="0" t="0" r="0" b="0"/>
             <wp:docPr id="7" name="C:\Users\Jennyfer\Desktop\Proyecto aplicaciones web\sigac\docs\capturas\05-servicios.png" descr="C:\Users\Jennyfer\Desktop\Proyecto aplicaciones web\sigac\docs\capturas\05-servicios.png" title="C:\Users\Jennyfer\Desktop\Proyecto aplicaciones web\sigac\docs\capturas\05-servicios.png"/>
@@ -14044,7 +14044,7 @@
         </w:rPr>
         <w:lastRenderedPageBreak/>
         <w:drawing>
-          <wp:inline distT="0" distB="0" distL="0" distR="0" wp14:anchorId="1308DEEF" wp14:editId="565D4041">
+          <wp:inline distT="0" distB="0" distL="0" distR="0" wp14:anchorId="75A0EBF1" wp14:editId="3988690C">
             <wp:extent cx="4476750" cy="2514600"/>
             <wp:effectExtent l="0" t="0" r="0" b="0"/>
             <wp:docPr id="8" name="C:\Users\Jennyfer\Desktop\Proyecto aplicaciones web\sigac\docs\capturas\06-cuentas-por-cobrar.png" descr="C:\Users\Jennyfer\Desktop\Proyecto aplicaciones web\sigac\docs\capturas\06-cuentas-por-cobrar.png" title="C:\Users\Jennyfer\Desktop\Proyecto aplicaciones web\sigac\docs\capturas\06-cuentas-por-cobrar.png"/>
@@ -14109,7 +14109,7 @@
           <w:noProof/>
         </w:rPr>
         <w:drawing>
-          <wp:inline distT="0" distB="0" distL="0" distR="0" wp14:anchorId="5276D7C0" wp14:editId="343FCE4C">
+          <wp:inline distT="0" distB="0" distL="0" distR="0" wp14:anchorId="4132CBCC" wp14:editId="54C1342A">
             <wp:extent cx="4476750" cy="2514600"/>
             <wp:effectExtent l="0" t="0" r="0" b="0"/>
             <wp:docPr id="9" name="C:\Users\Jennyfer\Desktop\Proyecto aplicaciones web\sigac\docs\capturas\07-cobranza-resumen.png" descr="C:\Users\Jennyfer\Desktop\Proyecto aplicaciones web\sigac\docs\capturas\07-cobranza-resumen.png" title="C:\Users\Jennyfer\Desktop\Proyecto aplicaciones web\sigac\docs\capturas\07-cobranza-resumen.png"/>
@@ -14175,7 +14175,7 @@
         </w:rPr>
         <w:lastRenderedPageBreak/>
         <w:drawing>
-          <wp:inline distT="0" distB="0" distL="0" distR="0" wp14:anchorId="0EDA0285" wp14:editId="5C9F51AD">
+          <wp:inline distT="0" distB="0" distL="0" distR="0" wp14:anchorId="12FB0E0C" wp14:editId="44568D38">
             <wp:extent cx="4476750" cy="2514600"/>
             <wp:effectExtent l="0" t="0" r="0" b="0"/>
             <wp:docPr id="10" name="C:\Users\Jennyfer\Desktop\Proyecto aplicaciones web\sigac\docs\capturas\08-recibos.png" descr="C:\Users\Jennyfer\Desktop\Proyecto aplicaciones web\sigac\docs\capturas\08-recibos.png" title="C:\Users\Jennyfer\Desktop\Proyecto aplicaciones web\sigac\docs\capturas\08-recibos.png"/>
@@ -14240,7 +14240,7 @@
           <w:noProof/>
         </w:rPr>
         <w:drawing>
-          <wp:inline distT="0" distB="0" distL="0" distR="0" wp14:anchorId="670D3DE0" wp14:editId="020BA706">
+          <wp:inline distT="0" distB="0" distL="0" distR="0" wp14:anchorId="47747349" wp14:editId="59779E78">
             <wp:extent cx="4476750" cy="2514600"/>
             <wp:effectExtent l="0" t="0" r="0" b="0"/>
             <wp:docPr id="11" name="C:\Users\Jennyfer\Desktop\Proyecto aplicaciones web\sigac\docs\capturas\09-voucher-recibo.png" descr="C:\Users\Jennyfer\Desktop\Proyecto aplicaciones web\sigac\docs\capturas\09-voucher-recibo.png" title="C:\Users\Jennyfer\Desktop\Proyecto aplicaciones web\sigac\docs\capturas\09-voucher-recibo.png"/>
@@ -14306,7 +14306,7 @@
         </w:rPr>
         <w:lastRenderedPageBreak/>
         <w:drawing>
-          <wp:inline distT="0" distB="0" distL="0" distR="0" wp14:anchorId="14135332" wp14:editId="446B599E">
+          <wp:inline distT="0" distB="0" distL="0" distR="0" wp14:anchorId="5D075176" wp14:editId="7CCCFCF9">
             <wp:extent cx="4476750" cy="2514600"/>
             <wp:effectExtent l="0" t="0" r="0" b="0"/>
             <wp:docPr id="12" name="C:\Users\Jennyfer\Desktop\Proyecto aplicaciones web\sigac\docs\capturas\10-egresos.png" descr="C:\Users\Jennyfer\Desktop\Proyecto aplicaciones web\sigac\docs\capturas\10-egresos.png" title="C:\Users\Jennyfer\Desktop\Proyecto aplicaciones web\sigac\docs\capturas\10-egresos.png"/>
@@ -14371,7 +14371,7 @@
           <w:noProof/>
         </w:rPr>
         <w:drawing>
-          <wp:inline distT="0" distB="0" distL="0" distR="0" wp14:anchorId="6559D292" wp14:editId="41F01284">
+          <wp:inline distT="0" distB="0" distL="0" distR="0" wp14:anchorId="5F11C5E1" wp14:editId="47E13875">
             <wp:extent cx="4476750" cy="2514600"/>
             <wp:effectExtent l="0" t="0" r="0" b="0"/>
             <wp:docPr id="13" name="C:\Users\Jennyfer\Desktop\Proyecto aplicaciones web\sigac\docs\capturas\11-egresos-carga-masiva.png" descr="C:\Users\Jennyfer\Desktop\Proyecto aplicaciones web\sigac\docs\capturas\11-egresos-carga-masiva.png" title="C:\Users\Jennyfer\Desktop\Proyecto aplicaciones web\sigac\docs\capturas\11-egresos-carga-masiva.png"/>
@@ -14437,7 +14437,7 @@
         </w:rPr>
         <w:lastRenderedPageBreak/>
         <w:drawing>
-          <wp:inline distT="0" distB="0" distL="0" distR="0" wp14:anchorId="320325E0" wp14:editId="3DD0C6A3">
+          <wp:inline distT="0" distB="0" distL="0" distR="0" wp14:anchorId="263FB3AD" wp14:editId="74DCBF26">
             <wp:extent cx="4476750" cy="2514600"/>
             <wp:effectExtent l="0" t="0" r="0" b="0"/>
             <wp:docPr id="14" name="C:\Users\Jennyfer\Desktop\Proyecto aplicaciones web\sigac\docs\capturas\12-reportes.png" descr="C:\Users\Jennyfer\Desktop\Proyecto aplicaciones web\sigac\docs\capturas\12-reportes.png" title="C:\Users\Jennyfer\Desktop\Proyecto aplicaciones web\sigac\docs\capturas\12-reportes.png"/>
@@ -14502,7 +14502,7 @@
           <w:noProof/>
         </w:rPr>
         <w:drawing>
-          <wp:inline distT="0" distB="0" distL="0" distR="0" wp14:anchorId="0D6120E7" wp14:editId="6237EE8B">
+          <wp:inline distT="0" distB="0" distL="0" distR="0" wp14:anchorId="539E03B3" wp14:editId="7000BD45">
             <wp:extent cx="4476750" cy="2514600"/>
             <wp:effectExtent l="0" t="0" r="0" b="0"/>
             <wp:docPr id="15" name="C:\Users\Jennyfer\Desktop\Proyecto aplicaciones web\sigac\docs\capturas\13-ingreso-externo.png" descr="C:\Users\Jennyfer\Desktop\Proyecto aplicaciones web\sigac\docs\capturas\13-ingreso-externo.png" title="C:\Users\Jennyfer\Desktop\Proyecto aplicaciones web\sigac\docs\capturas\13-ingreso-externo.png"/>
@@ -14568,7 +14568,7 @@
         </w:rPr>
         <w:lastRenderedPageBreak/>
         <w:drawing>
-          <wp:inline distT="0" distB="0" distL="0" distR="0" wp14:anchorId="16C74648" wp14:editId="75DFEE54">
+          <wp:inline distT="0" distB="0" distL="0" distR="0" wp14:anchorId="6769F8B3" wp14:editId="6776D5F3">
             <wp:extent cx="4476750" cy="2514600"/>
             <wp:effectExtent l="0" t="0" r="0" b="0"/>
             <wp:docPr id="16" name="C:\Users\Jennyfer\Desktop\Proyecto aplicaciones web\sigac\docs\capturas\14-operador-cobranza.png" descr="C:\Users\Jennyfer\Desktop\Proyecto aplicaciones web\sigac\docs\capturas\14-operador-cobranza.png" title="C:\Users\Jennyfer\Desktop\Proyecto aplicaciones web\sigac\docs\capturas\14-operador-cobranza.png"/>
@@ -14633,7 +14633,7 @@
           <w:noProof/>
         </w:rPr>
         <w:drawing>
-          <wp:inline distT="0" distB="0" distL="0" distR="0" wp14:anchorId="2AC6F2DF" wp14:editId="2D600D49">
+          <wp:inline distT="0" distB="0" distL="0" distR="0" wp14:anchorId="54FAACD5" wp14:editId="2FC55440">
             <wp:extent cx="4476750" cy="2514600"/>
             <wp:effectExtent l="0" t="0" r="0" b="0"/>
             <wp:docPr id="17" name="C:\Users\Jennyfer\Desktop\Proyecto aplicaciones web\sigac\docs\capturas\15-auditoria.png" descr="C:\Users\Jennyfer\Desktop\Proyecto aplicaciones web\sigac\docs\capturas\15-auditoria.png" title="C:\Users\Jennyfer\Desktop\Proyecto aplicaciones web\sigac\docs\capturas\15-auditoria.png"/>
@@ -14699,7 +14699,7 @@
         </w:rPr>
         <w:lastRenderedPageBreak/>
         <w:drawing>
-          <wp:inline distT="0" distB="0" distL="0" distR="0" wp14:anchorId="58EA6CCE" wp14:editId="345CF906">
+          <wp:inline distT="0" distB="0" distL="0" distR="0" wp14:anchorId="403DF22B" wp14:editId="23802A13">
             <wp:extent cx="4476750" cy="2514600"/>
             <wp:effectExtent l="0" t="0" r="0" b="0"/>
             <wp:docPr id="18" name="C:\Users\Jennyfer\Desktop\Proyecto aplicaciones web\sigac\docs\capturas\16-eureka.png" descr="C:\Users\Jennyfer\Desktop\Proyecto aplicaciones web\sigac\docs\capturas\16-eureka.png" title="C:\Users\Jennyfer\Desktop\Proyecto aplicaciones web\sigac\docs\capturas\16-eureka.png"/>
@@ -14757,7 +14757,7 @@
       <w:pPr>
         <w:pStyle w:val="Ttulo2"/>
       </w:pPr>
-      <w:bookmarkStart w:id="26" w:name="_Toc243754342"/>
+      <w:bookmarkStart w:id="26" w:name="_Toc243756173"/>
       <w:r>
         <w:t>Anexo B. Endpoints de los servicios web REST</w:t>
       </w:r>
@@ -22987,7 +22987,7 @@
       <w:pPr>
         <w:pStyle w:val="Ttulo2"/>
       </w:pPr>
-      <w:bookmarkStart w:id="27" w:name="_Toc243754343"/>
+      <w:bookmarkStart w:id="27" w:name="_Toc243756174"/>
       <w:r>
         <w:t>Anexo C. Matriz de cumplimiento de requisitos funcionales</w:t>
       </w:r>
@@ -27238,7 +27238,7 @@
       <w:pPr>
         <w:pStyle w:val="Ttulo2"/>
       </w:pPr>
-      <w:bookmarkStart w:id="28" w:name="_Toc243754344"/>
+      <w:bookmarkStart w:id="28" w:name="_Toc243756175"/>
       <w:r>
         <w:t>Anexo D. Pruebas automatizadas</w:t>
       </w:r>
@@ -28388,7 +28388,7 @@
       <w:pPr>
         <w:pStyle w:val="Ttulo2"/>
       </w:pPr>
-      <w:bookmarkStart w:id="29" w:name="_Toc243754345"/>
+      <w:bookmarkStart w:id="29" w:name="_Toc243756176"/>
       <w:r>
         <w:t>Anexo E. Modelo de datos</w:t>
       </w:r>
@@ -28414,7 +28414,7 @@
         </w:rPr>
         <w:lastRenderedPageBreak/>
         <w:drawing>
-          <wp:inline distT="0" distB="0" distL="0" distR="0" wp14:anchorId="6DCA1B04" wp14:editId="7D7B5F5C">
+          <wp:inline distT="0" distB="0" distL="0" distR="0" wp14:anchorId="06DAD533" wp14:editId="1431C525">
             <wp:extent cx="5715000" cy="3028950"/>
             <wp:effectExtent l="0" t="0" r="0" b="0"/>
             <wp:docPr id="19" name="C:\Users\Jennyfer\Desktop\Proyecto aplicaciones web\sigac\docs\diagramas\modelo-datos.png" descr="C:\Users\Jennyfer\Desktop\Proyecto aplicaciones web\sigac\docs\diagramas\modelo-datos.png" title="C:\Users\Jennyfer\Desktop\Proyecto aplicaciones web\sigac\docs\diagramas\modelo-datos.png"/>
@@ -28472,7 +28472,7 @@
       <w:pPr>
         <w:pStyle w:val="Ttulo2"/>
       </w:pPr>
-      <w:bookmarkStart w:id="30" w:name="_Toc243754346"/>
+      <w:bookmarkStart w:id="30" w:name="_Toc243756177"/>
       <w:r>
         <w:t>Anexo F. Matriz de cumplimiento de la rúbrica del curso</w:t>
       </w:r>
@@ -29483,7 +29483,7 @@
       <w:pPr>
         <w:pStyle w:val="Ttulo2"/>
       </w:pPr>
-      <w:bookmarkStart w:id="31" w:name="_Toc243754347"/>
+      <w:bookmarkStart w:id="31" w:name="_Toc243756178"/>
       <w:r>
         <w:t>Anexo G. Guion del video Demo Reel estructurado (3 a 5 minutos)</w:t>
       </w:r>
@@ -30903,7 +30903,7 @@
       <w:pPr>
         <w:pStyle w:val="Ttulo2"/>
       </w:pPr>
-      <w:bookmarkStart w:id="32" w:name="_Toc243754348"/>
+      <w:bookmarkStart w:id="32" w:name="_Toc243756179"/>
       <w:r>
         <w:t>Anexo H. Manual de ejecución</w:t>
       </w:r>
@@ -32100,68 +32100,10 @@
 <file path=word/numbering.xml><?xml version="1.0" encoding="utf-8"?>
 <w:numbering xmlns:wpc="http://schemas.microsoft.com/office/word/2010/wordprocessingCanvas" xmlns:cx="http://schemas.microsoft.com/office/drawing/2014/chartex" xmlns:cx1="http://schemas.microsoft.com/office/drawing/2015/9/8/chartex" xmlns:cx2="http://schemas.microsoft.com/office/drawing/2015/10/21/chartex" xmlns:cx3="http://schemas.microsoft.com/office/drawing/2016/5/9/chartex" xmlns:cx4="http://schemas.microsoft.com/office/drawing/2016/5/10/chartex" xmlns:cx5="http://schemas.microsoft.com/office/drawing/2016/5/11/chartex" xmlns:cx6="http://schemas.microsoft.com/office/drawing/2016/5/12/chartex" xmlns:cx7="http://schemas.microsoft.com/office/drawing/2016/5/13/chartex" xmlns:cx8="http://schemas.microsoft.com/office/drawing/2016/5/14/chartex" xmlns:mc="http://schemas.openxmlformats.org/markup-compatibility/2006" xmlns:aink="http://schemas.microsoft.com/office/drawing/2016/ink" xmlns:am3d="http://schemas.microsoft.com/office/drawing/2017/model3d" xmlns:o="urn:schemas-microsoft-com:office:office" xmlns:oel="http://schemas.microsoft.com/office/2019/extlst" xmlns:r="http://schemas.openxmlformats.org/officeDocument/2006/relationships" xmlns:m="http://schemas.openxmlformats.org/officeDocument/2006/math" xmlns:v="urn:schemas-microsoft-com:vml" xmlns:wp14="http://schemas.microsoft.com/office/word/2010/wordprocessingDrawing" xmlns:wp="http://schemas.openxmlformats.org/drawingml/2006/wordprocessingDrawing" xmlns:w10="urn:schemas-microsoft-com:office:word" xmlns:w="http://schemas.openxmlformats.org/wordprocessingml/2006/main" xmlns:w14="http://schemas.microsoft.com/office/word/2010/wordml" xmlns:w15="http://schemas.microsoft.com/office/word/2012/wordml" xmlns:w16cex="http://schemas.microsoft.com/office/word/2018/wordml/cex" xmlns:w16cid="http://schemas.microsoft.com/office/word/2016/wordml/cid" xmlns:w16="http://schemas.microsoft.com/office/word/2018/wordml" xmlns:w16du="http://schemas.microsoft.com/office/word/2023/wordml/word16du" xmlns:w16sdtdh="http://schemas.microsoft.com/office/word/2020/wordml/sdtdatahash" xmlns:w16sdtfl="http://schemas.microsoft.com/office/word/2024/wordml/sdtformatlock" xmlns:w16se="http://schemas.microsoft.com/office/word/2015/wordml/symex" xmlns:wpg="http://schemas.microsoft.com/office/word/2010/wordprocessingGroup" xmlns:wpi="http://schemas.microsoft.com/office/word/2010/wordprocessingInk" xmlns:wne="http://schemas.microsoft.com/office/word/2006/wordml" xmlns:wps="http://schemas.microsoft.com/office/word/2010/wordprocessingShape" mc:Ignorable="w14 w15 w16se w16cid w16 w16cex w16sdtdh w16sdtfl w16du wp14">
   <w:abstractNum w:abstractNumId="0" w15:restartNumberingAfterBreak="0">
-    <w:nsid w:val="1336302B"/>
+    <w:nsid w:val="388B5FA7"/>
     <w:multiLevelType w:val="hybridMultilevel"/>
-    <w:tmpl w:val="5DF60BC2"/>
-    <w:lvl w:ilvl="0" w:tplc="4DBEE388">
-      <w:start w:val="1"/>
-      <w:numFmt w:val="bullet"/>
-      <w:lvlText w:val="•"/>
-      <w:lvlJc w:val="left"/>
-      <w:pPr>
-        <w:ind w:left="567" w:hanging="283"/>
-      </w:pPr>
-    </w:lvl>
-    <w:lvl w:ilvl="1" w:tplc="9BBE6EB0" w:tentative="1">
-      <w:start w:val="1"/>
-      <w:numFmt w:val="bullet"/>
-      <w:lvlText w:val="–"/>
-      <w:lvlJc w:val="left"/>
-      <w:pPr>
-        <w:ind w:left="1134" w:hanging="283"/>
-      </w:pPr>
-    </w:lvl>
-    <w:lvl w:ilvl="2" w:tplc="BEE4CCD4">
-      <w:numFmt w:val="decimal"/>
-      <w:lvlText w:val=""/>
-      <w:lvlJc w:val="left"/>
-    </w:lvl>
-    <w:lvl w:ilvl="3" w:tplc="85BE3728">
-      <w:numFmt w:val="decimal"/>
-      <w:lvlText w:val=""/>
-      <w:lvlJc w:val="left"/>
-    </w:lvl>
-    <w:lvl w:ilvl="4" w:tplc="61F8EF3C">
-      <w:numFmt w:val="decimal"/>
-      <w:lvlText w:val=""/>
-      <w:lvlJc w:val="left"/>
-    </w:lvl>
-    <w:lvl w:ilvl="5" w:tplc="6AF829EA">
-      <w:numFmt w:val="decimal"/>
-      <w:lvlText w:val=""/>
-      <w:lvlJc w:val="left"/>
-    </w:lvl>
-    <w:lvl w:ilvl="6" w:tplc="5A2CC82A">
-      <w:numFmt w:val="decimal"/>
-      <w:lvlText w:val=""/>
-      <w:lvlJc w:val="left"/>
-    </w:lvl>
-    <w:lvl w:ilvl="7" w:tplc="816CA9D2">
-      <w:numFmt w:val="decimal"/>
-      <w:lvlText w:val=""/>
-      <w:lvlJc w:val="left"/>
-    </w:lvl>
-    <w:lvl w:ilvl="8" w:tplc="7290A2B8">
-      <w:numFmt w:val="decimal"/>
-      <w:lvlText w:val=""/>
-      <w:lvlJc w:val="left"/>
-    </w:lvl>
-  </w:abstractNum>
-  <w:abstractNum w:abstractNumId="1" w15:restartNumberingAfterBreak="0">
-    <w:nsid w:val="4C6A49DF"/>
-    <w:multiLevelType w:val="hybridMultilevel"/>
-    <w:tmpl w:val="AFBA0C2A"/>
-    <w:lvl w:ilvl="0" w:tplc="276CCB82" w:tentative="1">
+    <w:tmpl w:val="E9BC51B0"/>
+    <w:lvl w:ilvl="0" w:tplc="233C2FE6" w:tentative="1">
       <w:start w:val="1"/>
       <w:numFmt w:val="bullet"/>
       <w:lvlText w:val="●"/>
@@ -32170,7 +32112,7 @@
         <w:ind w:left="720" w:hanging="360"/>
       </w:pPr>
     </w:lvl>
-    <w:lvl w:ilvl="1" w:tplc="D796500A" w:tentative="1">
+    <w:lvl w:ilvl="1" w:tplc="D29AD4C0" w:tentative="1">
       <w:start w:val="1"/>
       <w:numFmt w:val="bullet"/>
       <w:lvlText w:val="○"/>
@@ -32179,7 +32121,7 @@
         <w:ind w:left="1440" w:hanging="360"/>
       </w:pPr>
     </w:lvl>
-    <w:lvl w:ilvl="2" w:tplc="E4AC1CC8" w:tentative="1">
+    <w:lvl w:ilvl="2" w:tplc="6346FBB2" w:tentative="1">
       <w:start w:val="1"/>
       <w:numFmt w:val="bullet"/>
       <w:lvlText w:val="■"/>
@@ -32188,7 +32130,7 @@
         <w:ind w:left="2160" w:hanging="360"/>
       </w:pPr>
     </w:lvl>
-    <w:lvl w:ilvl="3" w:tplc="A4329174" w:tentative="1">
+    <w:lvl w:ilvl="3" w:tplc="733C5568" w:tentative="1">
       <w:start w:val="1"/>
       <w:numFmt w:val="bullet"/>
       <w:lvlText w:val="●"/>
@@ -32197,7 +32139,7 @@
         <w:ind w:left="2880" w:hanging="360"/>
       </w:pPr>
     </w:lvl>
-    <w:lvl w:ilvl="4" w:tplc="9A6ED98E" w:tentative="1">
+    <w:lvl w:ilvl="4" w:tplc="1158B55E" w:tentative="1">
       <w:start w:val="1"/>
       <w:numFmt w:val="bullet"/>
       <w:lvlText w:val="○"/>
@@ -32206,7 +32148,7 @@
         <w:ind w:left="3600" w:hanging="360"/>
       </w:pPr>
     </w:lvl>
-    <w:lvl w:ilvl="5" w:tplc="BE961066" w:tentative="1">
+    <w:lvl w:ilvl="5" w:tplc="8B40A542" w:tentative="1">
       <w:start w:val="1"/>
       <w:numFmt w:val="bullet"/>
       <w:lvlText w:val="■"/>
@@ -32215,7 +32157,7 @@
         <w:ind w:left="4320" w:hanging="360"/>
       </w:pPr>
     </w:lvl>
-    <w:lvl w:ilvl="6" w:tplc="92043CB8" w:tentative="1">
+    <w:lvl w:ilvl="6" w:tplc="4F001016" w:tentative="1">
       <w:start w:val="1"/>
       <w:numFmt w:val="bullet"/>
       <w:lvlText w:val="●"/>
@@ -32224,7 +32166,7 @@
         <w:ind w:left="5040" w:hanging="360"/>
       </w:pPr>
     </w:lvl>
-    <w:lvl w:ilvl="7" w:tplc="B6A2EB3A" w:tentative="1">
+    <w:lvl w:ilvl="7" w:tplc="900A7902" w:tentative="1">
       <w:start w:val="1"/>
       <w:numFmt w:val="bullet"/>
       <w:lvlText w:val="●"/>
@@ -32233,7 +32175,7 @@
         <w:ind w:left="5760" w:hanging="360"/>
       </w:pPr>
     </w:lvl>
-    <w:lvl w:ilvl="8" w:tplc="A17A44D6" w:tentative="1">
+    <w:lvl w:ilvl="8" w:tplc="D604E850" w:tentative="1">
       <w:start w:val="1"/>
       <w:numFmt w:val="bullet"/>
       <w:lvlText w:val="●"/>
@@ -32243,14 +32185,72 @@
       </w:pPr>
     </w:lvl>
   </w:abstractNum>
-  <w:num w:numId="1" w16cid:durableId="782963843">
-    <w:abstractNumId w:val="1"/>
+  <w:abstractNum w:abstractNumId="1" w15:restartNumberingAfterBreak="0">
+    <w:nsid w:val="6DD97CBF"/>
+    <w:multiLevelType w:val="hybridMultilevel"/>
+    <w:tmpl w:val="1CC623E0"/>
+    <w:lvl w:ilvl="0" w:tplc="A5E82C0C">
+      <w:start w:val="1"/>
+      <w:numFmt w:val="bullet"/>
+      <w:lvlText w:val="•"/>
+      <w:lvlJc w:val="left"/>
+      <w:pPr>
+        <w:ind w:left="567" w:hanging="283"/>
+      </w:pPr>
+    </w:lvl>
+    <w:lvl w:ilvl="1" w:tplc="32FEC620" w:tentative="1">
+      <w:start w:val="1"/>
+      <w:numFmt w:val="bullet"/>
+      <w:lvlText w:val="–"/>
+      <w:lvlJc w:val="left"/>
+      <w:pPr>
+        <w:ind w:left="1134" w:hanging="283"/>
+      </w:pPr>
+    </w:lvl>
+    <w:lvl w:ilvl="2" w:tplc="60367EDE">
+      <w:numFmt w:val="decimal"/>
+      <w:lvlText w:val=""/>
+      <w:lvlJc w:val="left"/>
+    </w:lvl>
+    <w:lvl w:ilvl="3" w:tplc="8FE6FA54">
+      <w:numFmt w:val="decimal"/>
+      <w:lvlText w:val=""/>
+      <w:lvlJc w:val="left"/>
+    </w:lvl>
+    <w:lvl w:ilvl="4" w:tplc="0AF22B7E">
+      <w:numFmt w:val="decimal"/>
+      <w:lvlText w:val=""/>
+      <w:lvlJc w:val="left"/>
+    </w:lvl>
+    <w:lvl w:ilvl="5" w:tplc="C93812C8">
+      <w:numFmt w:val="decimal"/>
+      <w:lvlText w:val=""/>
+      <w:lvlJc w:val="left"/>
+    </w:lvl>
+    <w:lvl w:ilvl="6" w:tplc="DF985644">
+      <w:numFmt w:val="decimal"/>
+      <w:lvlText w:val=""/>
+      <w:lvlJc w:val="left"/>
+    </w:lvl>
+    <w:lvl w:ilvl="7" w:tplc="D54408E6">
+      <w:numFmt w:val="decimal"/>
+      <w:lvlText w:val=""/>
+      <w:lvlJc w:val="left"/>
+    </w:lvl>
+    <w:lvl w:ilvl="8" w:tplc="ACA25728">
+      <w:numFmt w:val="decimal"/>
+      <w:lvlText w:val=""/>
+      <w:lvlJc w:val="left"/>
+    </w:lvl>
+  </w:abstractNum>
+  <w:num w:numId="1" w16cid:durableId="162479223">
+    <w:abstractNumId w:val="0"/>
     <w:lvlOverride w:ilvl="0">
       <w:startOverride w:val="1"/>
     </w:lvlOverride>
   </w:num>
-  <w:num w:numId="2" w16cid:durableId="49616447">
-    <w:abstractNumId w:val="0"/>
+  <w:num w:numId="2" w16cid:durableId="1934510548">
+    <w:abstractNumId w:val="1"/>
     <w:lvlOverride w:ilvl="0">
       <w:startOverride w:val="1"/>
     </w:lvlOverride>
@@ -32902,7 +32902,7 @@
     <w:autoRedefine/>
     <w:uiPriority w:val="39"/>
     <w:unhideWhenUsed/>
-    <w:rsid w:val="001434C3"/>
+    <w:rsid w:val="00705760"/>
     <w:pPr>
       <w:spacing w:after="100"/>
     </w:pPr>
@@ -32914,7 +32914,7 @@
     <w:autoRedefine/>
     <w:uiPriority w:val="39"/>
     <w:unhideWhenUsed/>
-    <w:rsid w:val="001434C3"/>
+    <w:rsid w:val="00705760"/>
     <w:pPr>
       <w:spacing w:after="100"/>
       <w:ind w:left="220"/>

</xml_diff>